<commit_message>
Add Telegram bot commands for recurring meetings
- /recurring: list active weekly recurring templates
- /book: ask "Lặp lại hàng tuần?" to create a recurring series via the bot
- /stopseries: pick a template and stop the whole series (cancels future
  occurrences), with a confirm step
- Wrappers in _appsScript.js (list/create/cancelRecurringTemplate) and the
  command list + help text updated; Word guide and README refreshed.

Co-Authored-By: Claude Opus 4.8 <noreply@anthropic.com>
</commit_message>
<xml_diff>
--- a/Huong-dan-su-dung-MeetingHub.docx
+++ b/Huong-dan-su-dung-MeetingHub.docx
@@ -50,7 +50,7 @@
     </w:p>
     <w:p>
       <w:pPr>
-        <w:pStyle w:val="16"/>
+        <w:pStyle w:val="15"/>
         <w:keepNext w:val="0"/>
         <w:keepLines w:val="0"/>
         <w:widowControl/>
@@ -68,7 +68,7 @@
     </w:p>
     <w:p>
       <w:pPr>
-        <w:pStyle w:val="16"/>
+        <w:pStyle w:val="15"/>
         <w:keepNext w:val="0"/>
         <w:keepLines w:val="0"/>
         <w:widowControl/>
@@ -716,7 +716,6 @@
             <w:insideH w:val="none" w:color="auto" w:sz="0" w:space="0"/>
             <w:insideV w:val="none" w:color="auto" w:sz="0" w:space="0"/>
           </w:tblBorders>
-          <w:shd w:val="clear"/>
           <w:tblCellMar>
             <w:top w:w="15" w:type="dxa"/>
             <w:left w:w="15" w:type="dxa"/>
@@ -1441,7 +1440,6 @@
             <w:insideH w:val="none" w:color="auto" w:sz="0" w:space="0"/>
             <w:insideV w:val="none" w:color="auto" w:sz="0" w:space="0"/>
           </w:tblBorders>
-          <w:shd w:val="clear"/>
           <w:tblCellMar>
             <w:top w:w="15" w:type="dxa"/>
             <w:left w:w="15" w:type="dxa"/>
@@ -1671,7 +1669,6 @@
             <w:insideH w:val="none" w:color="auto" w:sz="0" w:space="0"/>
             <w:insideV w:val="none" w:color="auto" w:sz="0" w:space="0"/>
           </w:tblBorders>
-          <w:shd w:val="clear"/>
           <w:tblCellMar>
             <w:top w:w="15" w:type="dxa"/>
             <w:left w:w="15" w:type="dxa"/>
@@ -2026,7 +2023,6 @@
             <w:insideH w:val="none" w:color="auto" w:sz="0" w:space="0"/>
             <w:insideV w:val="none" w:color="auto" w:sz="0" w:space="0"/>
           </w:tblBorders>
-          <w:shd w:val="clear"/>
           <w:tblCellMar>
             <w:top w:w="15" w:type="dxa"/>
             <w:left w:w="15" w:type="dxa"/>
@@ -4176,8 +4172,8 @@
         </w:tblCellMar>
       </w:tblPr>
       <w:tblGrid>
-        <w:gridCol w:w="1409"/>
-        <w:gridCol w:w="7137"/>
+        <w:gridCol w:w="1450"/>
+        <w:gridCol w:w="7096"/>
       </w:tblGrid>
       <w:tr>
         <w:tblPrEx>
@@ -4797,7 +4793,7 @@
                 <w:sz w:val="22"/>
                 <w:szCs w:val="22"/>
               </w:rPr>
-              <w:t>/book</w:t>
+              <w:t>/recurring</w:t>
             </w:r>
           </w:p>
         </w:tc>
@@ -4843,7 +4839,7 @@
                 <w:szCs w:val="22"/>
                 <w:bdr w:val="none" w:color="auto" w:sz="0" w:space="0"/>
               </w:rPr>
-              <w:t>Bắt đầu đặt lịch mới (bot sẽ hỏi từng bước: ngày, giờ, chủ đề).</w:t>
+              <w:t>Xem danh sách các lịch lặp lại hàng tuần đang bật.</w:t>
             </w:r>
           </w:p>
         </w:tc>
@@ -4858,6 +4854,7 @@
             <w:insideH w:val="none" w:color="auto" w:sz="0" w:space="0"/>
             <w:insideV w:val="none" w:color="auto" w:sz="0" w:space="0"/>
           </w:tblBorders>
+          <w:shd w:val="clear"/>
           <w:tblCellMar>
             <w:top w:w="15" w:type="dxa"/>
             <w:left w:w="15" w:type="dxa"/>
@@ -4906,6 +4903,138 @@
                 <w:sz w:val="22"/>
                 <w:szCs w:val="22"/>
               </w:rPr>
+              <w:t>/book</w:t>
+            </w:r>
+          </w:p>
+        </w:tc>
+        <w:tc>
+          <w:tcPr>
+            <w:tcW w:w="0" w:type="auto"/>
+            <w:tcBorders>
+              <w:top w:val="single" w:color="999999" w:sz="4" w:space="0"/>
+              <w:left w:val="single" w:color="999999" w:sz="4" w:space="0"/>
+              <w:bottom w:val="single" w:color="999999" w:sz="4" w:space="0"/>
+              <w:right w:val="single" w:color="999999" w:sz="4" w:space="0"/>
+            </w:tcBorders>
+            <w:shd w:val="clear"/>
+            <w:tcMar>
+              <w:top w:w="72" w:type="dxa"/>
+              <w:left w:w="120" w:type="dxa"/>
+              <w:bottom w:w="72" w:type="dxa"/>
+              <w:right w:w="120" w:type="dxa"/>
+            </w:tcMar>
+            <w:vAlign w:val="top"/>
+          </w:tcPr>
+          <w:p>
+            <w:pPr>
+              <w:keepNext w:val="0"/>
+              <w:keepLines w:val="0"/>
+              <w:widowControl/>
+              <w:suppressLineNumbers w:val="0"/>
+              <w:spacing w:line="18" w:lineRule="atLeast"/>
+              <w:jc w:val="left"/>
+              <w:textAlignment w:val="top"/>
+              <w:rPr>
+                <w:rFonts w:hint="default" w:ascii="Segoe UI" w:hAnsi="Segoe UI" w:eastAsia="Segoe UI" w:cs="Segoe UI"/>
+                <w:color w:val="222222"/>
+                <w:sz w:val="22"/>
+                <w:szCs w:val="22"/>
+              </w:rPr>
+            </w:pPr>
+            <w:r>
+              <w:rPr>
+                <w:rFonts w:hint="default" w:ascii="Segoe UI" w:hAnsi="Segoe UI" w:eastAsia="Segoe UI" w:cs="Segoe UI"/>
+                <w:color w:val="222222"/>
+                <w:sz w:val="22"/>
+                <w:szCs w:val="22"/>
+                <w:bdr w:val="none" w:color="auto" w:sz="0" w:space="0"/>
+              </w:rPr>
+              <w:t xml:space="preserve">Bắt đầu đặt lịch mới. Bot sẽ hỏi thêm </w:t>
+            </w:r>
+            <w:r>
+              <w:rPr>
+                <w:rFonts w:hint="default" w:ascii="Segoe UI" w:hAnsi="Segoe UI" w:eastAsia="Segoe UI" w:cs="Segoe UI"/>
+                <w:b/>
+                <w:bCs/>
+                <w:color w:val="222222"/>
+                <w:sz w:val="22"/>
+                <w:szCs w:val="22"/>
+                <w:bdr w:val="none" w:color="auto" w:sz="0" w:space="0"/>
+              </w:rPr>
+              <w:t>“Lặp lại hàng tuần?”</w:t>
+            </w:r>
+            <w:r>
+              <w:rPr>
+                <w:rFonts w:hint="default" w:ascii="Segoe UI" w:hAnsi="Segoe UI" w:eastAsia="Segoe UI" w:cs="Segoe UI"/>
+                <w:color w:val="222222"/>
+                <w:sz w:val="22"/>
+                <w:szCs w:val="22"/>
+                <w:bdr w:val="none" w:color="auto" w:sz="0" w:space="0"/>
+              </w:rPr>
+              <w:t xml:space="preserve"> — gõ “có” để tạo lịch lặp.</w:t>
+            </w:r>
+          </w:p>
+        </w:tc>
+      </w:tr>
+      <w:tr>
+        <w:tblPrEx>
+          <w:tblBorders>
+            <w:top w:val="none" w:color="auto" w:sz="0" w:space="0"/>
+            <w:left w:val="none" w:color="auto" w:sz="0" w:space="0"/>
+            <w:bottom w:val="none" w:color="auto" w:sz="0" w:space="0"/>
+            <w:right w:val="none" w:color="auto" w:sz="0" w:space="0"/>
+            <w:insideH w:val="none" w:color="auto" w:sz="0" w:space="0"/>
+            <w:insideV w:val="none" w:color="auto" w:sz="0" w:space="0"/>
+          </w:tblBorders>
+          <w:shd w:val="clear"/>
+          <w:tblCellMar>
+            <w:top w:w="15" w:type="dxa"/>
+            <w:left w:w="15" w:type="dxa"/>
+            <w:bottom w:w="15" w:type="dxa"/>
+            <w:right w:w="15" w:type="dxa"/>
+          </w:tblCellMar>
+        </w:tblPrEx>
+        <w:tc>
+          <w:tcPr>
+            <w:tcW w:w="0" w:type="auto"/>
+            <w:tcBorders>
+              <w:top w:val="single" w:color="999999" w:sz="4" w:space="0"/>
+              <w:left w:val="single" w:color="999999" w:sz="4" w:space="0"/>
+              <w:bottom w:val="single" w:color="999999" w:sz="4" w:space="0"/>
+              <w:right w:val="single" w:color="999999" w:sz="4" w:space="0"/>
+            </w:tcBorders>
+            <w:shd w:val="clear"/>
+            <w:tcMar>
+              <w:top w:w="72" w:type="dxa"/>
+              <w:left w:w="120" w:type="dxa"/>
+              <w:bottom w:w="72" w:type="dxa"/>
+              <w:right w:w="120" w:type="dxa"/>
+            </w:tcMar>
+            <w:vAlign w:val="top"/>
+          </w:tcPr>
+          <w:p>
+            <w:pPr>
+              <w:keepNext w:val="0"/>
+              <w:keepLines w:val="0"/>
+              <w:widowControl/>
+              <w:suppressLineNumbers w:val="0"/>
+              <w:spacing w:line="18" w:lineRule="atLeast"/>
+              <w:jc w:val="left"/>
+              <w:textAlignment w:val="top"/>
+              <w:rPr>
+                <w:rFonts w:hint="default" w:ascii="Segoe UI" w:hAnsi="Segoe UI" w:eastAsia="Segoe UI" w:cs="Segoe UI"/>
+                <w:color w:val="222222"/>
+                <w:sz w:val="22"/>
+                <w:szCs w:val="22"/>
+              </w:rPr>
+            </w:pPr>
+            <w:r>
+              <w:rPr>
+                <w:rStyle w:val="10"/>
+                <w:rFonts w:ascii="SimSun" w:hAnsi="SimSun" w:eastAsia="SimSun" w:cs="SimSun"/>
+                <w:sz w:val="22"/>
+                <w:szCs w:val="22"/>
+              </w:rPr>
               <w:t>/cancel</w:t>
             </w:r>
           </w:p>
@@ -4952,7 +5081,161 @@
                 <w:szCs w:val="22"/>
                 <w:bdr w:val="none" w:color="auto" w:sz="0" w:space="0"/>
               </w:rPr>
-              <w:t>Bắt đầu hủy một lịch.</w:t>
+              <w:t xml:space="preserve">Hủy </w:t>
+            </w:r>
+            <w:r>
+              <w:rPr>
+                <w:rFonts w:hint="default" w:ascii="Segoe UI" w:hAnsi="Segoe UI" w:eastAsia="Segoe UI" w:cs="Segoe UI"/>
+                <w:b/>
+                <w:bCs/>
+                <w:color w:val="222222"/>
+                <w:sz w:val="22"/>
+                <w:szCs w:val="22"/>
+                <w:bdr w:val="none" w:color="auto" w:sz="0" w:space="0"/>
+              </w:rPr>
+              <w:t>một buổi</w:t>
+            </w:r>
+            <w:r>
+              <w:rPr>
+                <w:rFonts w:hint="default" w:ascii="Segoe UI" w:hAnsi="Segoe UI" w:eastAsia="Segoe UI" w:cs="Segoe UI"/>
+                <w:color w:val="222222"/>
+                <w:sz w:val="22"/>
+                <w:szCs w:val="22"/>
+                <w:bdr w:val="none" w:color="auto" w:sz="0" w:space="0"/>
+              </w:rPr>
+              <w:t xml:space="preserve"> (kể cả một buổi thuộc lịch lặp; buổi đó không bị tạo lại).</w:t>
+            </w:r>
+          </w:p>
+        </w:tc>
+      </w:tr>
+      <w:tr>
+        <w:tblPrEx>
+          <w:tblBorders>
+            <w:top w:val="none" w:color="auto" w:sz="0" w:space="0"/>
+            <w:left w:val="none" w:color="auto" w:sz="0" w:space="0"/>
+            <w:bottom w:val="none" w:color="auto" w:sz="0" w:space="0"/>
+            <w:right w:val="none" w:color="auto" w:sz="0" w:space="0"/>
+            <w:insideH w:val="none" w:color="auto" w:sz="0" w:space="0"/>
+            <w:insideV w:val="none" w:color="auto" w:sz="0" w:space="0"/>
+          </w:tblBorders>
+          <w:shd w:val="clear"/>
+          <w:tblCellMar>
+            <w:top w:w="15" w:type="dxa"/>
+            <w:left w:w="15" w:type="dxa"/>
+            <w:bottom w:w="15" w:type="dxa"/>
+            <w:right w:w="15" w:type="dxa"/>
+          </w:tblCellMar>
+        </w:tblPrEx>
+        <w:tc>
+          <w:tcPr>
+            <w:tcW w:w="0" w:type="auto"/>
+            <w:tcBorders>
+              <w:top w:val="single" w:color="999999" w:sz="4" w:space="0"/>
+              <w:left w:val="single" w:color="999999" w:sz="4" w:space="0"/>
+              <w:bottom w:val="single" w:color="999999" w:sz="4" w:space="0"/>
+              <w:right w:val="single" w:color="999999" w:sz="4" w:space="0"/>
+            </w:tcBorders>
+            <w:shd w:val="clear"/>
+            <w:tcMar>
+              <w:top w:w="72" w:type="dxa"/>
+              <w:left w:w="120" w:type="dxa"/>
+              <w:bottom w:w="72" w:type="dxa"/>
+              <w:right w:w="120" w:type="dxa"/>
+            </w:tcMar>
+            <w:vAlign w:val="top"/>
+          </w:tcPr>
+          <w:p>
+            <w:pPr>
+              <w:keepNext w:val="0"/>
+              <w:keepLines w:val="0"/>
+              <w:widowControl/>
+              <w:suppressLineNumbers w:val="0"/>
+              <w:spacing w:line="18" w:lineRule="atLeast"/>
+              <w:jc w:val="left"/>
+              <w:textAlignment w:val="top"/>
+              <w:rPr>
+                <w:rFonts w:hint="default" w:ascii="Segoe UI" w:hAnsi="Segoe UI" w:eastAsia="Segoe UI" w:cs="Segoe UI"/>
+                <w:color w:val="222222"/>
+                <w:sz w:val="22"/>
+                <w:szCs w:val="22"/>
+              </w:rPr>
+            </w:pPr>
+            <w:r>
+              <w:rPr>
+                <w:rStyle w:val="10"/>
+                <w:rFonts w:ascii="SimSun" w:hAnsi="SimSun" w:eastAsia="SimSun" w:cs="SimSun"/>
+                <w:sz w:val="22"/>
+                <w:szCs w:val="22"/>
+              </w:rPr>
+              <w:t>/stopseries</w:t>
+            </w:r>
+          </w:p>
+        </w:tc>
+        <w:tc>
+          <w:tcPr>
+            <w:tcW w:w="0" w:type="auto"/>
+            <w:tcBorders>
+              <w:top w:val="single" w:color="999999" w:sz="4" w:space="0"/>
+              <w:left w:val="single" w:color="999999" w:sz="4" w:space="0"/>
+              <w:bottom w:val="single" w:color="999999" w:sz="4" w:space="0"/>
+              <w:right w:val="single" w:color="999999" w:sz="4" w:space="0"/>
+            </w:tcBorders>
+            <w:shd w:val="clear"/>
+            <w:tcMar>
+              <w:top w:w="72" w:type="dxa"/>
+              <w:left w:w="120" w:type="dxa"/>
+              <w:bottom w:w="72" w:type="dxa"/>
+              <w:right w:w="120" w:type="dxa"/>
+            </w:tcMar>
+            <w:vAlign w:val="top"/>
+          </w:tcPr>
+          <w:p>
+            <w:pPr>
+              <w:keepNext w:val="0"/>
+              <w:keepLines w:val="0"/>
+              <w:widowControl/>
+              <w:suppressLineNumbers w:val="0"/>
+              <w:spacing w:line="18" w:lineRule="atLeast"/>
+              <w:jc w:val="left"/>
+              <w:textAlignment w:val="top"/>
+              <w:rPr>
+                <w:rFonts w:hint="default" w:ascii="Segoe UI" w:hAnsi="Segoe UI" w:eastAsia="Segoe UI" w:cs="Segoe UI"/>
+                <w:color w:val="222222"/>
+                <w:sz w:val="22"/>
+                <w:szCs w:val="22"/>
+              </w:rPr>
+            </w:pPr>
+            <w:r>
+              <w:rPr>
+                <w:rFonts w:hint="default" w:ascii="Segoe UI" w:hAnsi="Segoe UI" w:eastAsia="Segoe UI" w:cs="Segoe UI"/>
+                <w:color w:val="222222"/>
+                <w:sz w:val="22"/>
+                <w:szCs w:val="22"/>
+                <w:bdr w:val="none" w:color="auto" w:sz="0" w:space="0"/>
+              </w:rPr>
+              <w:t xml:space="preserve">Ngừng </w:t>
+            </w:r>
+            <w:r>
+              <w:rPr>
+                <w:rFonts w:hint="default" w:ascii="Segoe UI" w:hAnsi="Segoe UI" w:eastAsia="Segoe UI" w:cs="Segoe UI"/>
+                <w:b/>
+                <w:bCs/>
+                <w:color w:val="222222"/>
+                <w:sz w:val="22"/>
+                <w:szCs w:val="22"/>
+                <w:bdr w:val="none" w:color="auto" w:sz="0" w:space="0"/>
+              </w:rPr>
+              <w:t>cả một chuỗi</w:t>
+            </w:r>
+            <w:r>
+              <w:rPr>
+                <w:rFonts w:hint="default" w:ascii="Segoe UI" w:hAnsi="Segoe UI" w:eastAsia="Segoe UI" w:cs="Segoe UI"/>
+                <w:color w:val="222222"/>
+                <w:sz w:val="22"/>
+                <w:szCs w:val="22"/>
+                <w:bdr w:val="none" w:color="auto" w:sz="0" w:space="0"/>
+              </w:rPr>
+              <w:t xml:space="preserve"> lịch lặp — các buổi tương lai sẽ bị hủy.</w:t>
             </w:r>
           </w:p>
         </w:tc>
@@ -5586,8 +5869,8 @@
         </w:tblCellMar>
       </w:tblPr>
       <w:tblGrid>
-        <w:gridCol w:w="2578"/>
-        <w:gridCol w:w="5968"/>
+        <w:gridCol w:w="4153"/>
+        <w:gridCol w:w="4153"/>
       </w:tblGrid>
       <w:tr>
         <w:tblPrEx>
@@ -5600,6 +5883,12 @@
             <w:insideV w:val="none" w:color="auto" w:sz="0" w:space="0"/>
           </w:tblBorders>
           <w:shd w:val="clear"/>
+          <w:tblCellMar>
+            <w:top w:w="15" w:type="dxa"/>
+            <w:left w:w="15" w:type="dxa"/>
+            <w:bottom w:w="15" w:type="dxa"/>
+            <w:right w:w="15" w:type="dxa"/>
+          </w:tblCellMar>
         </w:tblPrEx>
         <w:tc>
           <w:tcPr>
@@ -5845,7 +6134,6 @@
             <w:insideH w:val="none" w:color="auto" w:sz="0" w:space="0"/>
             <w:insideV w:val="none" w:color="auto" w:sz="0" w:space="0"/>
           </w:tblBorders>
-          <w:shd w:val="clear"/>
           <w:tblCellMar>
             <w:top w:w="15" w:type="dxa"/>
             <w:left w:w="15" w:type="dxa"/>
@@ -5956,7 +6244,6 @@
             <w:insideH w:val="none" w:color="auto" w:sz="0" w:space="0"/>
             <w:insideV w:val="none" w:color="auto" w:sz="0" w:space="0"/>
           </w:tblBorders>
-          <w:shd w:val="clear"/>
           <w:tblCellMar>
             <w:top w:w="15" w:type="dxa"/>
             <w:left w:w="15" w:type="dxa"/>
@@ -6336,9 +6623,605 @@
 <file path=word/numbering.xml><?xml version="1.0" encoding="utf-8"?>
 <w:numbering xmlns:wpc="http://schemas.microsoft.com/office/word/2010/wordprocessingCanvas" xmlns:mc="http://schemas.openxmlformats.org/markup-compatibility/2006" xmlns:o="urn:schemas-microsoft-com:office:office" xmlns:r="http://schemas.openxmlformats.org/officeDocument/2006/relationships" xmlns:m="http://schemas.openxmlformats.org/officeDocument/2006/math" xmlns:v="urn:schemas-microsoft-com:vml" xmlns:wp14="http://schemas.microsoft.com/office/word/2010/wordprocessingDrawing" xmlns:wp="http://schemas.openxmlformats.org/drawingml/2006/wordprocessingDrawing" xmlns:w10="urn:schemas-microsoft-com:office:word" xmlns:w="http://schemas.openxmlformats.org/wordprocessingml/2006/main" xmlns:w14="http://schemas.microsoft.com/office/word/2010/wordml" xmlns:wpg="http://schemas.microsoft.com/office/word/2010/wordprocessingGroup" xmlns:wpi="http://schemas.microsoft.com/office/word/2010/wordprocessingInk" xmlns:wne="http://schemas.microsoft.com/office/word/2006/wordml" xmlns:wps="http://schemas.microsoft.com/office/word/2010/wordprocessingShape" xmlns:wpsCustomData="http://www.wps.cn/officeDocument/2013/wpsCustomData" mc:Ignorable="w14 wp14">
   <w:abstractNum w:abstractNumId="0">
-    <w:nsid w:val="9653DA8F"/>
+    <w:nsid w:val="B2C796FB"/>
     <w:multiLevelType w:val="multilevel"/>
-    <w:tmpl w:val="9653DA8F"/>
+    <w:tmpl w:val="B2C796FB"/>
+    <w:lvl w:ilvl="0" w:tentative="0">
+      <w:start w:val="1"/>
+      <w:numFmt w:val="decimal"/>
+      <w:lvlText w:val="%1."/>
+      <w:lvlJc w:val="left"/>
+      <w:pPr>
+        <w:tabs>
+          <w:tab w:val="left" w:pos="720"/>
+        </w:tabs>
+        <w:ind w:left="720" w:hanging="360"/>
+      </w:pPr>
+      <w:rPr>
+        <w:sz w:val="24"/>
+        <w:szCs w:val="24"/>
+      </w:rPr>
+    </w:lvl>
+    <w:lvl w:ilvl="1" w:tentative="0">
+      <w:start w:val="1"/>
+      <w:numFmt w:val="decimal"/>
+      <w:lvlText w:val="%2."/>
+      <w:lvlJc w:val="left"/>
+      <w:pPr>
+        <w:tabs>
+          <w:tab w:val="left" w:pos="1440"/>
+        </w:tabs>
+        <w:ind w:left="1440" w:hanging="360"/>
+      </w:pPr>
+      <w:rPr>
+        <w:sz w:val="24"/>
+        <w:szCs w:val="24"/>
+      </w:rPr>
+    </w:lvl>
+    <w:lvl w:ilvl="2" w:tentative="0">
+      <w:start w:val="1"/>
+      <w:numFmt w:val="decimal"/>
+      <w:lvlText w:val="%3."/>
+      <w:lvlJc w:val="left"/>
+      <w:pPr>
+        <w:tabs>
+          <w:tab w:val="left" w:pos="2160"/>
+        </w:tabs>
+        <w:ind w:left="2160" w:hanging="360"/>
+      </w:pPr>
+      <w:rPr>
+        <w:sz w:val="24"/>
+        <w:szCs w:val="24"/>
+      </w:rPr>
+    </w:lvl>
+    <w:lvl w:ilvl="3" w:tentative="0">
+      <w:start w:val="1"/>
+      <w:numFmt w:val="decimal"/>
+      <w:lvlText w:val="%4."/>
+      <w:lvlJc w:val="left"/>
+      <w:pPr>
+        <w:tabs>
+          <w:tab w:val="left" w:pos="2517"/>
+        </w:tabs>
+        <w:ind w:left="2880" w:hanging="360"/>
+      </w:pPr>
+      <w:rPr>
+        <w:sz w:val="24"/>
+        <w:szCs w:val="24"/>
+      </w:rPr>
+    </w:lvl>
+    <w:lvl w:ilvl="4" w:tentative="0">
+      <w:start w:val="1"/>
+      <w:numFmt w:val="decimal"/>
+      <w:lvlText w:val="%5."/>
+      <w:lvlJc w:val="left"/>
+      <w:pPr>
+        <w:tabs>
+          <w:tab w:val="left" w:pos="3238"/>
+        </w:tabs>
+        <w:ind w:left="3600" w:hanging="360"/>
+      </w:pPr>
+      <w:rPr>
+        <w:sz w:val="24"/>
+        <w:szCs w:val="24"/>
+      </w:rPr>
+    </w:lvl>
+    <w:lvl w:ilvl="5" w:tentative="0">
+      <w:start w:val="1"/>
+      <w:numFmt w:val="decimal"/>
+      <w:lvlText w:val="%6."/>
+      <w:lvlJc w:val="left"/>
+      <w:pPr>
+        <w:tabs>
+          <w:tab w:val="left" w:pos="3958"/>
+        </w:tabs>
+        <w:ind w:left="4320" w:hanging="360"/>
+      </w:pPr>
+      <w:rPr>
+        <w:sz w:val="24"/>
+        <w:szCs w:val="24"/>
+      </w:rPr>
+    </w:lvl>
+    <w:lvl w:ilvl="6" w:tentative="0">
+      <w:start w:val="1"/>
+      <w:numFmt w:val="decimal"/>
+      <w:lvlText w:val="%7."/>
+      <w:lvlJc w:val="left"/>
+      <w:pPr>
+        <w:tabs>
+          <w:tab w:val="left" w:pos="4678"/>
+        </w:tabs>
+        <w:ind w:left="5040" w:hanging="360"/>
+      </w:pPr>
+      <w:rPr>
+        <w:sz w:val="24"/>
+        <w:szCs w:val="24"/>
+      </w:rPr>
+    </w:lvl>
+    <w:lvl w:ilvl="7" w:tentative="0">
+      <w:start w:val="1"/>
+      <w:numFmt w:val="decimal"/>
+      <w:lvlText w:val="%8."/>
+      <w:lvlJc w:val="left"/>
+      <w:pPr>
+        <w:tabs>
+          <w:tab w:val="left" w:pos="5398"/>
+        </w:tabs>
+        <w:ind w:left="5760" w:hanging="360"/>
+      </w:pPr>
+      <w:rPr>
+        <w:sz w:val="24"/>
+        <w:szCs w:val="24"/>
+      </w:rPr>
+    </w:lvl>
+    <w:lvl w:ilvl="8" w:tentative="0">
+      <w:start w:val="1"/>
+      <w:numFmt w:val="decimal"/>
+      <w:lvlText w:val="%9."/>
+      <w:lvlJc w:val="left"/>
+      <w:pPr>
+        <w:tabs>
+          <w:tab w:val="left" w:pos="6118"/>
+        </w:tabs>
+        <w:ind w:left="6480" w:hanging="360"/>
+      </w:pPr>
+      <w:rPr>
+        <w:sz w:val="24"/>
+        <w:szCs w:val="24"/>
+      </w:rPr>
+    </w:lvl>
+  </w:abstractNum>
+  <w:abstractNum w:abstractNumId="1">
+    <w:nsid w:val="C62D4120"/>
+    <w:multiLevelType w:val="multilevel"/>
+    <w:tmpl w:val="C62D4120"/>
+    <w:lvl w:ilvl="0" w:tentative="0">
+      <w:start w:val="1"/>
+      <w:numFmt w:val="decimal"/>
+      <w:lvlText w:val="%1."/>
+      <w:lvlJc w:val="left"/>
+      <w:pPr>
+        <w:tabs>
+          <w:tab w:val="left" w:pos="720"/>
+        </w:tabs>
+        <w:ind w:left="720" w:hanging="360"/>
+      </w:pPr>
+      <w:rPr>
+        <w:sz w:val="24"/>
+        <w:szCs w:val="24"/>
+      </w:rPr>
+    </w:lvl>
+    <w:lvl w:ilvl="1" w:tentative="0">
+      <w:start w:val="1"/>
+      <w:numFmt w:val="decimal"/>
+      <w:lvlText w:val="%2."/>
+      <w:lvlJc w:val="left"/>
+      <w:pPr>
+        <w:tabs>
+          <w:tab w:val="left" w:pos="1440"/>
+        </w:tabs>
+        <w:ind w:left="1440" w:hanging="360"/>
+      </w:pPr>
+      <w:rPr>
+        <w:sz w:val="24"/>
+        <w:szCs w:val="24"/>
+      </w:rPr>
+    </w:lvl>
+    <w:lvl w:ilvl="2" w:tentative="0">
+      <w:start w:val="1"/>
+      <w:numFmt w:val="decimal"/>
+      <w:lvlText w:val="%3."/>
+      <w:lvlJc w:val="left"/>
+      <w:pPr>
+        <w:tabs>
+          <w:tab w:val="left" w:pos="2160"/>
+        </w:tabs>
+        <w:ind w:left="2160" w:hanging="360"/>
+      </w:pPr>
+      <w:rPr>
+        <w:sz w:val="24"/>
+        <w:szCs w:val="24"/>
+      </w:rPr>
+    </w:lvl>
+    <w:lvl w:ilvl="3" w:tentative="0">
+      <w:start w:val="1"/>
+      <w:numFmt w:val="decimal"/>
+      <w:lvlText w:val="%4."/>
+      <w:lvlJc w:val="left"/>
+      <w:pPr>
+        <w:tabs>
+          <w:tab w:val="left" w:pos="2517"/>
+        </w:tabs>
+        <w:ind w:left="2880" w:hanging="360"/>
+      </w:pPr>
+      <w:rPr>
+        <w:sz w:val="24"/>
+        <w:szCs w:val="24"/>
+      </w:rPr>
+    </w:lvl>
+    <w:lvl w:ilvl="4" w:tentative="0">
+      <w:start w:val="1"/>
+      <w:numFmt w:val="decimal"/>
+      <w:lvlText w:val="%5."/>
+      <w:lvlJc w:val="left"/>
+      <w:pPr>
+        <w:tabs>
+          <w:tab w:val="left" w:pos="3238"/>
+        </w:tabs>
+        <w:ind w:left="3600" w:hanging="360"/>
+      </w:pPr>
+      <w:rPr>
+        <w:sz w:val="24"/>
+        <w:szCs w:val="24"/>
+      </w:rPr>
+    </w:lvl>
+    <w:lvl w:ilvl="5" w:tentative="0">
+      <w:start w:val="1"/>
+      <w:numFmt w:val="decimal"/>
+      <w:lvlText w:val="%6."/>
+      <w:lvlJc w:val="left"/>
+      <w:pPr>
+        <w:tabs>
+          <w:tab w:val="left" w:pos="3958"/>
+        </w:tabs>
+        <w:ind w:left="4320" w:hanging="360"/>
+      </w:pPr>
+      <w:rPr>
+        <w:sz w:val="24"/>
+        <w:szCs w:val="24"/>
+      </w:rPr>
+    </w:lvl>
+    <w:lvl w:ilvl="6" w:tentative="0">
+      <w:start w:val="1"/>
+      <w:numFmt w:val="decimal"/>
+      <w:lvlText w:val="%7."/>
+      <w:lvlJc w:val="left"/>
+      <w:pPr>
+        <w:tabs>
+          <w:tab w:val="left" w:pos="4678"/>
+        </w:tabs>
+        <w:ind w:left="5040" w:hanging="360"/>
+      </w:pPr>
+      <w:rPr>
+        <w:sz w:val="24"/>
+        <w:szCs w:val="24"/>
+      </w:rPr>
+    </w:lvl>
+    <w:lvl w:ilvl="7" w:tentative="0">
+      <w:start w:val="1"/>
+      <w:numFmt w:val="decimal"/>
+      <w:lvlText w:val="%8."/>
+      <w:lvlJc w:val="left"/>
+      <w:pPr>
+        <w:tabs>
+          <w:tab w:val="left" w:pos="5398"/>
+        </w:tabs>
+        <w:ind w:left="5760" w:hanging="360"/>
+      </w:pPr>
+      <w:rPr>
+        <w:sz w:val="24"/>
+        <w:szCs w:val="24"/>
+      </w:rPr>
+    </w:lvl>
+    <w:lvl w:ilvl="8" w:tentative="0">
+      <w:start w:val="1"/>
+      <w:numFmt w:val="decimal"/>
+      <w:lvlText w:val="%9."/>
+      <w:lvlJc w:val="left"/>
+      <w:pPr>
+        <w:tabs>
+          <w:tab w:val="left" w:pos="6118"/>
+        </w:tabs>
+        <w:ind w:left="6480" w:hanging="360"/>
+      </w:pPr>
+      <w:rPr>
+        <w:sz w:val="24"/>
+        <w:szCs w:val="24"/>
+      </w:rPr>
+    </w:lvl>
+  </w:abstractNum>
+  <w:abstractNum w:abstractNumId="2">
+    <w:nsid w:val="C7936C0A"/>
+    <w:multiLevelType w:val="multilevel"/>
+    <w:tmpl w:val="C7936C0A"/>
+    <w:lvl w:ilvl="0" w:tentative="0">
+      <w:start w:val="1"/>
+      <w:numFmt w:val="decimal"/>
+      <w:lvlText w:val="%1."/>
+      <w:lvlJc w:val="left"/>
+      <w:pPr>
+        <w:tabs>
+          <w:tab w:val="left" w:pos="720"/>
+        </w:tabs>
+        <w:ind w:left="720" w:hanging="360"/>
+      </w:pPr>
+      <w:rPr>
+        <w:sz w:val="24"/>
+        <w:szCs w:val="24"/>
+      </w:rPr>
+    </w:lvl>
+    <w:lvl w:ilvl="1" w:tentative="0">
+      <w:start w:val="1"/>
+      <w:numFmt w:val="decimal"/>
+      <w:lvlText w:val="%2."/>
+      <w:lvlJc w:val="left"/>
+      <w:pPr>
+        <w:tabs>
+          <w:tab w:val="left" w:pos="1440"/>
+        </w:tabs>
+        <w:ind w:left="1440" w:hanging="360"/>
+      </w:pPr>
+      <w:rPr>
+        <w:sz w:val="24"/>
+        <w:szCs w:val="24"/>
+      </w:rPr>
+    </w:lvl>
+    <w:lvl w:ilvl="2" w:tentative="0">
+      <w:start w:val="1"/>
+      <w:numFmt w:val="decimal"/>
+      <w:lvlText w:val="%3."/>
+      <w:lvlJc w:val="left"/>
+      <w:pPr>
+        <w:tabs>
+          <w:tab w:val="left" w:pos="2160"/>
+        </w:tabs>
+        <w:ind w:left="2160" w:hanging="360"/>
+      </w:pPr>
+      <w:rPr>
+        <w:sz w:val="24"/>
+        <w:szCs w:val="24"/>
+      </w:rPr>
+    </w:lvl>
+    <w:lvl w:ilvl="3" w:tentative="0">
+      <w:start w:val="1"/>
+      <w:numFmt w:val="decimal"/>
+      <w:lvlText w:val="%4."/>
+      <w:lvlJc w:val="left"/>
+      <w:pPr>
+        <w:tabs>
+          <w:tab w:val="left" w:pos="2517"/>
+        </w:tabs>
+        <w:ind w:left="2880" w:hanging="360"/>
+      </w:pPr>
+      <w:rPr>
+        <w:sz w:val="24"/>
+        <w:szCs w:val="24"/>
+      </w:rPr>
+    </w:lvl>
+    <w:lvl w:ilvl="4" w:tentative="0">
+      <w:start w:val="1"/>
+      <w:numFmt w:val="decimal"/>
+      <w:lvlText w:val="%5."/>
+      <w:lvlJc w:val="left"/>
+      <w:pPr>
+        <w:tabs>
+          <w:tab w:val="left" w:pos="3238"/>
+        </w:tabs>
+        <w:ind w:left="3600" w:hanging="360"/>
+      </w:pPr>
+      <w:rPr>
+        <w:sz w:val="24"/>
+        <w:szCs w:val="24"/>
+      </w:rPr>
+    </w:lvl>
+    <w:lvl w:ilvl="5" w:tentative="0">
+      <w:start w:val="1"/>
+      <w:numFmt w:val="decimal"/>
+      <w:lvlText w:val="%6."/>
+      <w:lvlJc w:val="left"/>
+      <w:pPr>
+        <w:tabs>
+          <w:tab w:val="left" w:pos="3958"/>
+        </w:tabs>
+        <w:ind w:left="4320" w:hanging="360"/>
+      </w:pPr>
+      <w:rPr>
+        <w:sz w:val="24"/>
+        <w:szCs w:val="24"/>
+      </w:rPr>
+    </w:lvl>
+    <w:lvl w:ilvl="6" w:tentative="0">
+      <w:start w:val="1"/>
+      <w:numFmt w:val="decimal"/>
+      <w:lvlText w:val="%7."/>
+      <w:lvlJc w:val="left"/>
+      <w:pPr>
+        <w:tabs>
+          <w:tab w:val="left" w:pos="4678"/>
+        </w:tabs>
+        <w:ind w:left="5040" w:hanging="360"/>
+      </w:pPr>
+      <w:rPr>
+        <w:sz w:val="24"/>
+        <w:szCs w:val="24"/>
+      </w:rPr>
+    </w:lvl>
+    <w:lvl w:ilvl="7" w:tentative="0">
+      <w:start w:val="1"/>
+      <w:numFmt w:val="decimal"/>
+      <w:lvlText w:val="%8."/>
+      <w:lvlJc w:val="left"/>
+      <w:pPr>
+        <w:tabs>
+          <w:tab w:val="left" w:pos="5398"/>
+        </w:tabs>
+        <w:ind w:left="5760" w:hanging="360"/>
+      </w:pPr>
+      <w:rPr>
+        <w:sz w:val="24"/>
+        <w:szCs w:val="24"/>
+      </w:rPr>
+    </w:lvl>
+    <w:lvl w:ilvl="8" w:tentative="0">
+      <w:start w:val="1"/>
+      <w:numFmt w:val="decimal"/>
+      <w:lvlText w:val="%9."/>
+      <w:lvlJc w:val="left"/>
+      <w:pPr>
+        <w:tabs>
+          <w:tab w:val="left" w:pos="6118"/>
+        </w:tabs>
+        <w:ind w:left="6480" w:hanging="360"/>
+      </w:pPr>
+      <w:rPr>
+        <w:sz w:val="24"/>
+        <w:szCs w:val="24"/>
+      </w:rPr>
+    </w:lvl>
+  </w:abstractNum>
+  <w:abstractNum w:abstractNumId="3">
+    <w:nsid w:val="D3474E19"/>
+    <w:multiLevelType w:val="multilevel"/>
+    <w:tmpl w:val="D3474E19"/>
+    <w:lvl w:ilvl="0" w:tentative="0">
+      <w:start w:val="1"/>
+      <w:numFmt w:val="decimal"/>
+      <w:lvlText w:val="%1."/>
+      <w:lvlJc w:val="left"/>
+      <w:pPr>
+        <w:tabs>
+          <w:tab w:val="left" w:pos="720"/>
+        </w:tabs>
+        <w:ind w:left="720" w:hanging="360"/>
+      </w:pPr>
+      <w:rPr>
+        <w:sz w:val="24"/>
+        <w:szCs w:val="24"/>
+      </w:rPr>
+    </w:lvl>
+    <w:lvl w:ilvl="1" w:tentative="0">
+      <w:start w:val="1"/>
+      <w:numFmt w:val="decimal"/>
+      <w:lvlText w:val="%2."/>
+      <w:lvlJc w:val="left"/>
+      <w:pPr>
+        <w:tabs>
+          <w:tab w:val="left" w:pos="1440"/>
+        </w:tabs>
+        <w:ind w:left="1440" w:hanging="360"/>
+      </w:pPr>
+      <w:rPr>
+        <w:sz w:val="24"/>
+        <w:szCs w:val="24"/>
+      </w:rPr>
+    </w:lvl>
+    <w:lvl w:ilvl="2" w:tentative="0">
+      <w:start w:val="1"/>
+      <w:numFmt w:val="decimal"/>
+      <w:lvlText w:val="%3."/>
+      <w:lvlJc w:val="left"/>
+      <w:pPr>
+        <w:tabs>
+          <w:tab w:val="left" w:pos="2160"/>
+        </w:tabs>
+        <w:ind w:left="2160" w:hanging="360"/>
+      </w:pPr>
+      <w:rPr>
+        <w:sz w:val="24"/>
+        <w:szCs w:val="24"/>
+      </w:rPr>
+    </w:lvl>
+    <w:lvl w:ilvl="3" w:tentative="0">
+      <w:start w:val="1"/>
+      <w:numFmt w:val="decimal"/>
+      <w:lvlText w:val="%4."/>
+      <w:lvlJc w:val="left"/>
+      <w:pPr>
+        <w:tabs>
+          <w:tab w:val="left" w:pos="2517"/>
+        </w:tabs>
+        <w:ind w:left="2880" w:hanging="360"/>
+      </w:pPr>
+      <w:rPr>
+        <w:sz w:val="24"/>
+        <w:szCs w:val="24"/>
+      </w:rPr>
+    </w:lvl>
+    <w:lvl w:ilvl="4" w:tentative="0">
+      <w:start w:val="1"/>
+      <w:numFmt w:val="decimal"/>
+      <w:lvlText w:val="%5."/>
+      <w:lvlJc w:val="left"/>
+      <w:pPr>
+        <w:tabs>
+          <w:tab w:val="left" w:pos="3238"/>
+        </w:tabs>
+        <w:ind w:left="3600" w:hanging="360"/>
+      </w:pPr>
+      <w:rPr>
+        <w:sz w:val="24"/>
+        <w:szCs w:val="24"/>
+      </w:rPr>
+    </w:lvl>
+    <w:lvl w:ilvl="5" w:tentative="0">
+      <w:start w:val="1"/>
+      <w:numFmt w:val="decimal"/>
+      <w:lvlText w:val="%6."/>
+      <w:lvlJc w:val="left"/>
+      <w:pPr>
+        <w:tabs>
+          <w:tab w:val="left" w:pos="3958"/>
+        </w:tabs>
+        <w:ind w:left="4320" w:hanging="360"/>
+      </w:pPr>
+      <w:rPr>
+        <w:sz w:val="24"/>
+        <w:szCs w:val="24"/>
+      </w:rPr>
+    </w:lvl>
+    <w:lvl w:ilvl="6" w:tentative="0">
+      <w:start w:val="1"/>
+      <w:numFmt w:val="decimal"/>
+      <w:lvlText w:val="%7."/>
+      <w:lvlJc w:val="left"/>
+      <w:pPr>
+        <w:tabs>
+          <w:tab w:val="left" w:pos="4678"/>
+        </w:tabs>
+        <w:ind w:left="5040" w:hanging="360"/>
+      </w:pPr>
+      <w:rPr>
+        <w:sz w:val="24"/>
+        <w:szCs w:val="24"/>
+      </w:rPr>
+    </w:lvl>
+    <w:lvl w:ilvl="7" w:tentative="0">
+      <w:start w:val="1"/>
+      <w:numFmt w:val="decimal"/>
+      <w:lvlText w:val="%8."/>
+      <w:lvlJc w:val="left"/>
+      <w:pPr>
+        <w:tabs>
+          <w:tab w:val="left" w:pos="5398"/>
+        </w:tabs>
+        <w:ind w:left="5760" w:hanging="360"/>
+      </w:pPr>
+      <w:rPr>
+        <w:sz w:val="24"/>
+        <w:szCs w:val="24"/>
+      </w:rPr>
+    </w:lvl>
+    <w:lvl w:ilvl="8" w:tentative="0">
+      <w:start w:val="1"/>
+      <w:numFmt w:val="decimal"/>
+      <w:lvlText w:val="%9."/>
+      <w:lvlJc w:val="left"/>
+      <w:pPr>
+        <w:tabs>
+          <w:tab w:val="left" w:pos="6118"/>
+        </w:tabs>
+        <w:ind w:left="6480" w:hanging="360"/>
+      </w:pPr>
+      <w:rPr>
+        <w:sz w:val="24"/>
+        <w:szCs w:val="24"/>
+      </w:rPr>
+    </w:lvl>
+  </w:abstractNum>
+  <w:abstractNum w:abstractNumId="4">
+    <w:nsid w:val="E2704482"/>
+    <w:multiLevelType w:val="multilevel"/>
+    <w:tmpl w:val="E2704482"/>
     <w:lvl w:ilvl="0" w:tentative="0">
       <w:start w:val="1"/>
       <w:numFmt w:val="bullet"/>
@@ -6484,10 +7367,159 @@
       </w:rPr>
     </w:lvl>
   </w:abstractNum>
-  <w:abstractNum w:abstractNumId="1">
-    <w:nsid w:val="96ADEC4A"/>
+  <w:abstractNum w:abstractNumId="5">
+    <w:nsid w:val="F47A15DF"/>
     <w:multiLevelType w:val="multilevel"/>
-    <w:tmpl w:val="96ADEC4A"/>
+    <w:tmpl w:val="F47A15DF"/>
+    <w:lvl w:ilvl="0" w:tentative="0">
+      <w:start w:val="1"/>
+      <w:numFmt w:val="decimal"/>
+      <w:lvlText w:val="%1."/>
+      <w:lvlJc w:val="left"/>
+      <w:pPr>
+        <w:tabs>
+          <w:tab w:val="left" w:pos="720"/>
+        </w:tabs>
+        <w:ind w:left="720" w:hanging="360"/>
+      </w:pPr>
+      <w:rPr>
+        <w:sz w:val="24"/>
+        <w:szCs w:val="24"/>
+      </w:rPr>
+    </w:lvl>
+    <w:lvl w:ilvl="1" w:tentative="0">
+      <w:start w:val="1"/>
+      <w:numFmt w:val="decimal"/>
+      <w:lvlText w:val="%2."/>
+      <w:lvlJc w:val="left"/>
+      <w:pPr>
+        <w:tabs>
+          <w:tab w:val="left" w:pos="1440"/>
+        </w:tabs>
+        <w:ind w:left="1440" w:hanging="360"/>
+      </w:pPr>
+      <w:rPr>
+        <w:sz w:val="24"/>
+        <w:szCs w:val="24"/>
+      </w:rPr>
+    </w:lvl>
+    <w:lvl w:ilvl="2" w:tentative="0">
+      <w:start w:val="1"/>
+      <w:numFmt w:val="decimal"/>
+      <w:lvlText w:val="%3."/>
+      <w:lvlJc w:val="left"/>
+      <w:pPr>
+        <w:tabs>
+          <w:tab w:val="left" w:pos="2160"/>
+        </w:tabs>
+        <w:ind w:left="2160" w:hanging="360"/>
+      </w:pPr>
+      <w:rPr>
+        <w:sz w:val="24"/>
+        <w:szCs w:val="24"/>
+      </w:rPr>
+    </w:lvl>
+    <w:lvl w:ilvl="3" w:tentative="0">
+      <w:start w:val="1"/>
+      <w:numFmt w:val="decimal"/>
+      <w:lvlText w:val="%4."/>
+      <w:lvlJc w:val="left"/>
+      <w:pPr>
+        <w:tabs>
+          <w:tab w:val="left" w:pos="2517"/>
+        </w:tabs>
+        <w:ind w:left="2880" w:hanging="360"/>
+      </w:pPr>
+      <w:rPr>
+        <w:sz w:val="24"/>
+        <w:szCs w:val="24"/>
+      </w:rPr>
+    </w:lvl>
+    <w:lvl w:ilvl="4" w:tentative="0">
+      <w:start w:val="1"/>
+      <w:numFmt w:val="decimal"/>
+      <w:lvlText w:val="%5."/>
+      <w:lvlJc w:val="left"/>
+      <w:pPr>
+        <w:tabs>
+          <w:tab w:val="left" w:pos="3238"/>
+        </w:tabs>
+        <w:ind w:left="3600" w:hanging="360"/>
+      </w:pPr>
+      <w:rPr>
+        <w:sz w:val="24"/>
+        <w:szCs w:val="24"/>
+      </w:rPr>
+    </w:lvl>
+    <w:lvl w:ilvl="5" w:tentative="0">
+      <w:start w:val="1"/>
+      <w:numFmt w:val="decimal"/>
+      <w:lvlText w:val="%6."/>
+      <w:lvlJc w:val="left"/>
+      <w:pPr>
+        <w:tabs>
+          <w:tab w:val="left" w:pos="3958"/>
+        </w:tabs>
+        <w:ind w:left="4320" w:hanging="360"/>
+      </w:pPr>
+      <w:rPr>
+        <w:sz w:val="24"/>
+        <w:szCs w:val="24"/>
+      </w:rPr>
+    </w:lvl>
+    <w:lvl w:ilvl="6" w:tentative="0">
+      <w:start w:val="1"/>
+      <w:numFmt w:val="decimal"/>
+      <w:lvlText w:val="%7."/>
+      <w:lvlJc w:val="left"/>
+      <w:pPr>
+        <w:tabs>
+          <w:tab w:val="left" w:pos="4678"/>
+        </w:tabs>
+        <w:ind w:left="5040" w:hanging="360"/>
+      </w:pPr>
+      <w:rPr>
+        <w:sz w:val="24"/>
+        <w:szCs w:val="24"/>
+      </w:rPr>
+    </w:lvl>
+    <w:lvl w:ilvl="7" w:tentative="0">
+      <w:start w:val="1"/>
+      <w:numFmt w:val="decimal"/>
+      <w:lvlText w:val="%8."/>
+      <w:lvlJc w:val="left"/>
+      <w:pPr>
+        <w:tabs>
+          <w:tab w:val="left" w:pos="5398"/>
+        </w:tabs>
+        <w:ind w:left="5760" w:hanging="360"/>
+      </w:pPr>
+      <w:rPr>
+        <w:sz w:val="24"/>
+        <w:szCs w:val="24"/>
+      </w:rPr>
+    </w:lvl>
+    <w:lvl w:ilvl="8" w:tentative="0">
+      <w:start w:val="1"/>
+      <w:numFmt w:val="decimal"/>
+      <w:lvlText w:val="%9."/>
+      <w:lvlJc w:val="left"/>
+      <w:pPr>
+        <w:tabs>
+          <w:tab w:val="left" w:pos="6118"/>
+        </w:tabs>
+        <w:ind w:left="6480" w:hanging="360"/>
+      </w:pPr>
+      <w:rPr>
+        <w:sz w:val="24"/>
+        <w:szCs w:val="24"/>
+      </w:rPr>
+    </w:lvl>
+  </w:abstractNum>
+  <w:abstractNum w:abstractNumId="6">
+    <w:nsid w:val="1B3FAB76"/>
+    <w:multiLevelType w:val="multilevel"/>
+    <w:tmpl w:val="1B3FAB76"/>
     <w:lvl w:ilvl="0" w:tentative="0">
       <w:start w:val="1"/>
       <w:numFmt w:val="bullet"/>
@@ -6633,10 +7665,10 @@
       </w:rPr>
     </w:lvl>
   </w:abstractNum>
-  <w:abstractNum w:abstractNumId="2">
-    <w:nsid w:val="C586979A"/>
+  <w:abstractNum w:abstractNumId="7">
+    <w:nsid w:val="215D8F11"/>
     <w:multiLevelType w:val="multilevel"/>
-    <w:tmpl w:val="C586979A"/>
+    <w:tmpl w:val="215D8F11"/>
     <w:lvl w:ilvl="0" w:tentative="0">
       <w:start w:val="1"/>
       <w:numFmt w:val="decimal"/>
@@ -6782,765 +7814,20 @@
       </w:rPr>
     </w:lvl>
   </w:abstractNum>
-  <w:abstractNum w:abstractNumId="3">
-    <w:nsid w:val="CC1F6B95"/>
-    <w:multiLevelType w:val="multilevel"/>
-    <w:tmpl w:val="CC1F6B95"/>
-    <w:lvl w:ilvl="0" w:tentative="0">
-      <w:start w:val="1"/>
-      <w:numFmt w:val="decimal"/>
-      <w:lvlText w:val="%1."/>
-      <w:lvlJc w:val="left"/>
-      <w:pPr>
-        <w:tabs>
-          <w:tab w:val="left" w:pos="720"/>
-        </w:tabs>
-        <w:ind w:left="720" w:hanging="360"/>
-      </w:pPr>
-      <w:rPr>
-        <w:sz w:val="24"/>
-        <w:szCs w:val="24"/>
-      </w:rPr>
-    </w:lvl>
-    <w:lvl w:ilvl="1" w:tentative="0">
-      <w:start w:val="1"/>
-      <w:numFmt w:val="decimal"/>
-      <w:lvlText w:val="%2."/>
-      <w:lvlJc w:val="left"/>
-      <w:pPr>
-        <w:tabs>
-          <w:tab w:val="left" w:pos="1440"/>
-        </w:tabs>
-        <w:ind w:left="1440" w:hanging="360"/>
-      </w:pPr>
-      <w:rPr>
-        <w:sz w:val="24"/>
-        <w:szCs w:val="24"/>
-      </w:rPr>
-    </w:lvl>
-    <w:lvl w:ilvl="2" w:tentative="0">
-      <w:start w:val="1"/>
-      <w:numFmt w:val="decimal"/>
-      <w:lvlText w:val="%3."/>
-      <w:lvlJc w:val="left"/>
-      <w:pPr>
-        <w:tabs>
-          <w:tab w:val="left" w:pos="2160"/>
-        </w:tabs>
-        <w:ind w:left="2160" w:hanging="360"/>
-      </w:pPr>
-      <w:rPr>
-        <w:sz w:val="24"/>
-        <w:szCs w:val="24"/>
-      </w:rPr>
-    </w:lvl>
-    <w:lvl w:ilvl="3" w:tentative="0">
-      <w:start w:val="1"/>
-      <w:numFmt w:val="decimal"/>
-      <w:lvlText w:val="%4."/>
-      <w:lvlJc w:val="left"/>
-      <w:pPr>
-        <w:tabs>
-          <w:tab w:val="left" w:pos="2517"/>
-        </w:tabs>
-        <w:ind w:left="2880" w:hanging="360"/>
-      </w:pPr>
-      <w:rPr>
-        <w:sz w:val="24"/>
-        <w:szCs w:val="24"/>
-      </w:rPr>
-    </w:lvl>
-    <w:lvl w:ilvl="4" w:tentative="0">
-      <w:start w:val="1"/>
-      <w:numFmt w:val="decimal"/>
-      <w:lvlText w:val="%5."/>
-      <w:lvlJc w:val="left"/>
-      <w:pPr>
-        <w:tabs>
-          <w:tab w:val="left" w:pos="3238"/>
-        </w:tabs>
-        <w:ind w:left="3600" w:hanging="360"/>
-      </w:pPr>
-      <w:rPr>
-        <w:sz w:val="24"/>
-        <w:szCs w:val="24"/>
-      </w:rPr>
-    </w:lvl>
-    <w:lvl w:ilvl="5" w:tentative="0">
-      <w:start w:val="1"/>
-      <w:numFmt w:val="decimal"/>
-      <w:lvlText w:val="%6."/>
-      <w:lvlJc w:val="left"/>
-      <w:pPr>
-        <w:tabs>
-          <w:tab w:val="left" w:pos="3958"/>
-        </w:tabs>
-        <w:ind w:left="4320" w:hanging="360"/>
-      </w:pPr>
-      <w:rPr>
-        <w:sz w:val="24"/>
-        <w:szCs w:val="24"/>
-      </w:rPr>
-    </w:lvl>
-    <w:lvl w:ilvl="6" w:tentative="0">
-      <w:start w:val="1"/>
-      <w:numFmt w:val="decimal"/>
-      <w:lvlText w:val="%7."/>
-      <w:lvlJc w:val="left"/>
-      <w:pPr>
-        <w:tabs>
-          <w:tab w:val="left" w:pos="4678"/>
-        </w:tabs>
-        <w:ind w:left="5040" w:hanging="360"/>
-      </w:pPr>
-      <w:rPr>
-        <w:sz w:val="24"/>
-        <w:szCs w:val="24"/>
-      </w:rPr>
-    </w:lvl>
-    <w:lvl w:ilvl="7" w:tentative="0">
-      <w:start w:val="1"/>
-      <w:numFmt w:val="decimal"/>
-      <w:lvlText w:val="%8."/>
-      <w:lvlJc w:val="left"/>
-      <w:pPr>
-        <w:tabs>
-          <w:tab w:val="left" w:pos="5398"/>
-        </w:tabs>
-        <w:ind w:left="5760" w:hanging="360"/>
-      </w:pPr>
-      <w:rPr>
-        <w:sz w:val="24"/>
-        <w:szCs w:val="24"/>
-      </w:rPr>
-    </w:lvl>
-    <w:lvl w:ilvl="8" w:tentative="0">
-      <w:start w:val="1"/>
-      <w:numFmt w:val="decimal"/>
-      <w:lvlText w:val="%9."/>
-      <w:lvlJc w:val="left"/>
-      <w:pPr>
-        <w:tabs>
-          <w:tab w:val="left" w:pos="6118"/>
-        </w:tabs>
-        <w:ind w:left="6480" w:hanging="360"/>
-      </w:pPr>
-      <w:rPr>
-        <w:sz w:val="24"/>
-        <w:szCs w:val="24"/>
-      </w:rPr>
-    </w:lvl>
-  </w:abstractNum>
-  <w:abstractNum w:abstractNumId="4">
-    <w:nsid w:val="D0E62121"/>
-    <w:multiLevelType w:val="multilevel"/>
-    <w:tmpl w:val="D0E62121"/>
-    <w:lvl w:ilvl="0" w:tentative="0">
-      <w:start w:val="1"/>
-      <w:numFmt w:val="decimal"/>
-      <w:lvlText w:val="%1."/>
-      <w:lvlJc w:val="left"/>
-      <w:pPr>
-        <w:tabs>
-          <w:tab w:val="left" w:pos="720"/>
-        </w:tabs>
-        <w:ind w:left="720" w:hanging="360"/>
-      </w:pPr>
-      <w:rPr>
-        <w:sz w:val="24"/>
-        <w:szCs w:val="24"/>
-      </w:rPr>
-    </w:lvl>
-    <w:lvl w:ilvl="1" w:tentative="0">
-      <w:start w:val="1"/>
-      <w:numFmt w:val="decimal"/>
-      <w:lvlText w:val="%2."/>
-      <w:lvlJc w:val="left"/>
-      <w:pPr>
-        <w:tabs>
-          <w:tab w:val="left" w:pos="1440"/>
-        </w:tabs>
-        <w:ind w:left="1440" w:hanging="360"/>
-      </w:pPr>
-      <w:rPr>
-        <w:sz w:val="24"/>
-        <w:szCs w:val="24"/>
-      </w:rPr>
-    </w:lvl>
-    <w:lvl w:ilvl="2" w:tentative="0">
-      <w:start w:val="1"/>
-      <w:numFmt w:val="decimal"/>
-      <w:lvlText w:val="%3."/>
-      <w:lvlJc w:val="left"/>
-      <w:pPr>
-        <w:tabs>
-          <w:tab w:val="left" w:pos="2160"/>
-        </w:tabs>
-        <w:ind w:left="2160" w:hanging="360"/>
-      </w:pPr>
-      <w:rPr>
-        <w:sz w:val="24"/>
-        <w:szCs w:val="24"/>
-      </w:rPr>
-    </w:lvl>
-    <w:lvl w:ilvl="3" w:tentative="0">
-      <w:start w:val="1"/>
-      <w:numFmt w:val="decimal"/>
-      <w:lvlText w:val="%4."/>
-      <w:lvlJc w:val="left"/>
-      <w:pPr>
-        <w:tabs>
-          <w:tab w:val="left" w:pos="2517"/>
-        </w:tabs>
-        <w:ind w:left="2880" w:hanging="360"/>
-      </w:pPr>
-      <w:rPr>
-        <w:sz w:val="24"/>
-        <w:szCs w:val="24"/>
-      </w:rPr>
-    </w:lvl>
-    <w:lvl w:ilvl="4" w:tentative="0">
-      <w:start w:val="1"/>
-      <w:numFmt w:val="decimal"/>
-      <w:lvlText w:val="%5."/>
-      <w:lvlJc w:val="left"/>
-      <w:pPr>
-        <w:tabs>
-          <w:tab w:val="left" w:pos="3238"/>
-        </w:tabs>
-        <w:ind w:left="3600" w:hanging="360"/>
-      </w:pPr>
-      <w:rPr>
-        <w:sz w:val="24"/>
-        <w:szCs w:val="24"/>
-      </w:rPr>
-    </w:lvl>
-    <w:lvl w:ilvl="5" w:tentative="0">
-      <w:start w:val="1"/>
-      <w:numFmt w:val="decimal"/>
-      <w:lvlText w:val="%6."/>
-      <w:lvlJc w:val="left"/>
-      <w:pPr>
-        <w:tabs>
-          <w:tab w:val="left" w:pos="3958"/>
-        </w:tabs>
-        <w:ind w:left="4320" w:hanging="360"/>
-      </w:pPr>
-      <w:rPr>
-        <w:sz w:val="24"/>
-        <w:szCs w:val="24"/>
-      </w:rPr>
-    </w:lvl>
-    <w:lvl w:ilvl="6" w:tentative="0">
-      <w:start w:val="1"/>
-      <w:numFmt w:val="decimal"/>
-      <w:lvlText w:val="%7."/>
-      <w:lvlJc w:val="left"/>
-      <w:pPr>
-        <w:tabs>
-          <w:tab w:val="left" w:pos="4678"/>
-        </w:tabs>
-        <w:ind w:left="5040" w:hanging="360"/>
-      </w:pPr>
-      <w:rPr>
-        <w:sz w:val="24"/>
-        <w:szCs w:val="24"/>
-      </w:rPr>
-    </w:lvl>
-    <w:lvl w:ilvl="7" w:tentative="0">
-      <w:start w:val="1"/>
-      <w:numFmt w:val="decimal"/>
-      <w:lvlText w:val="%8."/>
-      <w:lvlJc w:val="left"/>
-      <w:pPr>
-        <w:tabs>
-          <w:tab w:val="left" w:pos="5398"/>
-        </w:tabs>
-        <w:ind w:left="5760" w:hanging="360"/>
-      </w:pPr>
-      <w:rPr>
-        <w:sz w:val="24"/>
-        <w:szCs w:val="24"/>
-      </w:rPr>
-    </w:lvl>
-    <w:lvl w:ilvl="8" w:tentative="0">
-      <w:start w:val="1"/>
-      <w:numFmt w:val="decimal"/>
-      <w:lvlText w:val="%9."/>
-      <w:lvlJc w:val="left"/>
-      <w:pPr>
-        <w:tabs>
-          <w:tab w:val="left" w:pos="6118"/>
-        </w:tabs>
-        <w:ind w:left="6480" w:hanging="360"/>
-      </w:pPr>
-      <w:rPr>
-        <w:sz w:val="24"/>
-        <w:szCs w:val="24"/>
-      </w:rPr>
-    </w:lvl>
-  </w:abstractNum>
-  <w:abstractNum w:abstractNumId="5">
-    <w:nsid w:val="FCA6E956"/>
-    <w:multiLevelType w:val="multilevel"/>
-    <w:tmpl w:val="FCA6E956"/>
-    <w:lvl w:ilvl="0" w:tentative="0">
-      <w:start w:val="1"/>
-      <w:numFmt w:val="decimal"/>
-      <w:lvlText w:val="%1."/>
-      <w:lvlJc w:val="left"/>
-      <w:pPr>
-        <w:tabs>
-          <w:tab w:val="left" w:pos="720"/>
-        </w:tabs>
-        <w:ind w:left="720" w:hanging="360"/>
-      </w:pPr>
-      <w:rPr>
-        <w:sz w:val="24"/>
-        <w:szCs w:val="24"/>
-      </w:rPr>
-    </w:lvl>
-    <w:lvl w:ilvl="1" w:tentative="0">
-      <w:start w:val="1"/>
-      <w:numFmt w:val="decimal"/>
-      <w:lvlText w:val="%2."/>
-      <w:lvlJc w:val="left"/>
-      <w:pPr>
-        <w:tabs>
-          <w:tab w:val="left" w:pos="1440"/>
-        </w:tabs>
-        <w:ind w:left="1440" w:hanging="360"/>
-      </w:pPr>
-      <w:rPr>
-        <w:sz w:val="24"/>
-        <w:szCs w:val="24"/>
-      </w:rPr>
-    </w:lvl>
-    <w:lvl w:ilvl="2" w:tentative="0">
-      <w:start w:val="1"/>
-      <w:numFmt w:val="decimal"/>
-      <w:lvlText w:val="%3."/>
-      <w:lvlJc w:val="left"/>
-      <w:pPr>
-        <w:tabs>
-          <w:tab w:val="left" w:pos="2160"/>
-        </w:tabs>
-        <w:ind w:left="2160" w:hanging="360"/>
-      </w:pPr>
-      <w:rPr>
-        <w:sz w:val="24"/>
-        <w:szCs w:val="24"/>
-      </w:rPr>
-    </w:lvl>
-    <w:lvl w:ilvl="3" w:tentative="0">
-      <w:start w:val="1"/>
-      <w:numFmt w:val="decimal"/>
-      <w:lvlText w:val="%4."/>
-      <w:lvlJc w:val="left"/>
-      <w:pPr>
-        <w:tabs>
-          <w:tab w:val="left" w:pos="2517"/>
-        </w:tabs>
-        <w:ind w:left="2880" w:hanging="360"/>
-      </w:pPr>
-      <w:rPr>
-        <w:sz w:val="24"/>
-        <w:szCs w:val="24"/>
-      </w:rPr>
-    </w:lvl>
-    <w:lvl w:ilvl="4" w:tentative="0">
-      <w:start w:val="1"/>
-      <w:numFmt w:val="decimal"/>
-      <w:lvlText w:val="%5."/>
-      <w:lvlJc w:val="left"/>
-      <w:pPr>
-        <w:tabs>
-          <w:tab w:val="left" w:pos="3238"/>
-        </w:tabs>
-        <w:ind w:left="3600" w:hanging="360"/>
-      </w:pPr>
-      <w:rPr>
-        <w:sz w:val="24"/>
-        <w:szCs w:val="24"/>
-      </w:rPr>
-    </w:lvl>
-    <w:lvl w:ilvl="5" w:tentative="0">
-      <w:start w:val="1"/>
-      <w:numFmt w:val="decimal"/>
-      <w:lvlText w:val="%6."/>
-      <w:lvlJc w:val="left"/>
-      <w:pPr>
-        <w:tabs>
-          <w:tab w:val="left" w:pos="3958"/>
-        </w:tabs>
-        <w:ind w:left="4320" w:hanging="360"/>
-      </w:pPr>
-      <w:rPr>
-        <w:sz w:val="24"/>
-        <w:szCs w:val="24"/>
-      </w:rPr>
-    </w:lvl>
-    <w:lvl w:ilvl="6" w:tentative="0">
-      <w:start w:val="1"/>
-      <w:numFmt w:val="decimal"/>
-      <w:lvlText w:val="%7."/>
-      <w:lvlJc w:val="left"/>
-      <w:pPr>
-        <w:tabs>
-          <w:tab w:val="left" w:pos="4678"/>
-        </w:tabs>
-        <w:ind w:left="5040" w:hanging="360"/>
-      </w:pPr>
-      <w:rPr>
-        <w:sz w:val="24"/>
-        <w:szCs w:val="24"/>
-      </w:rPr>
-    </w:lvl>
-    <w:lvl w:ilvl="7" w:tentative="0">
-      <w:start w:val="1"/>
-      <w:numFmt w:val="decimal"/>
-      <w:lvlText w:val="%8."/>
-      <w:lvlJc w:val="left"/>
-      <w:pPr>
-        <w:tabs>
-          <w:tab w:val="left" w:pos="5398"/>
-        </w:tabs>
-        <w:ind w:left="5760" w:hanging="360"/>
-      </w:pPr>
-      <w:rPr>
-        <w:sz w:val="24"/>
-        <w:szCs w:val="24"/>
-      </w:rPr>
-    </w:lvl>
-    <w:lvl w:ilvl="8" w:tentative="0">
-      <w:start w:val="1"/>
-      <w:numFmt w:val="decimal"/>
-      <w:lvlText w:val="%9."/>
-      <w:lvlJc w:val="left"/>
-      <w:pPr>
-        <w:tabs>
-          <w:tab w:val="left" w:pos="6118"/>
-        </w:tabs>
-        <w:ind w:left="6480" w:hanging="360"/>
-      </w:pPr>
-      <w:rPr>
-        <w:sz w:val="24"/>
-        <w:szCs w:val="24"/>
-      </w:rPr>
-    </w:lvl>
-  </w:abstractNum>
-  <w:abstractNum w:abstractNumId="6">
-    <w:nsid w:val="0A248C7C"/>
-    <w:multiLevelType w:val="multilevel"/>
-    <w:tmpl w:val="0A248C7C"/>
-    <w:lvl w:ilvl="0" w:tentative="0">
-      <w:start w:val="1"/>
-      <w:numFmt w:val="decimal"/>
-      <w:lvlText w:val="%1."/>
-      <w:lvlJc w:val="left"/>
-      <w:pPr>
-        <w:tabs>
-          <w:tab w:val="left" w:pos="720"/>
-        </w:tabs>
-        <w:ind w:left="720" w:hanging="360"/>
-      </w:pPr>
-      <w:rPr>
-        <w:sz w:val="24"/>
-        <w:szCs w:val="24"/>
-      </w:rPr>
-    </w:lvl>
-    <w:lvl w:ilvl="1" w:tentative="0">
-      <w:start w:val="1"/>
-      <w:numFmt w:val="decimal"/>
-      <w:lvlText w:val="%2."/>
-      <w:lvlJc w:val="left"/>
-      <w:pPr>
-        <w:tabs>
-          <w:tab w:val="left" w:pos="1440"/>
-        </w:tabs>
-        <w:ind w:left="1440" w:hanging="360"/>
-      </w:pPr>
-      <w:rPr>
-        <w:sz w:val="24"/>
-        <w:szCs w:val="24"/>
-      </w:rPr>
-    </w:lvl>
-    <w:lvl w:ilvl="2" w:tentative="0">
-      <w:start w:val="1"/>
-      <w:numFmt w:val="decimal"/>
-      <w:lvlText w:val="%3."/>
-      <w:lvlJc w:val="left"/>
-      <w:pPr>
-        <w:tabs>
-          <w:tab w:val="left" w:pos="2160"/>
-        </w:tabs>
-        <w:ind w:left="2160" w:hanging="360"/>
-      </w:pPr>
-      <w:rPr>
-        <w:sz w:val="24"/>
-        <w:szCs w:val="24"/>
-      </w:rPr>
-    </w:lvl>
-    <w:lvl w:ilvl="3" w:tentative="0">
-      <w:start w:val="1"/>
-      <w:numFmt w:val="decimal"/>
-      <w:lvlText w:val="%4."/>
-      <w:lvlJc w:val="left"/>
-      <w:pPr>
-        <w:tabs>
-          <w:tab w:val="left" w:pos="2517"/>
-        </w:tabs>
-        <w:ind w:left="2880" w:hanging="360"/>
-      </w:pPr>
-      <w:rPr>
-        <w:sz w:val="24"/>
-        <w:szCs w:val="24"/>
-      </w:rPr>
-    </w:lvl>
-    <w:lvl w:ilvl="4" w:tentative="0">
-      <w:start w:val="1"/>
-      <w:numFmt w:val="decimal"/>
-      <w:lvlText w:val="%5."/>
-      <w:lvlJc w:val="left"/>
-      <w:pPr>
-        <w:tabs>
-          <w:tab w:val="left" w:pos="3238"/>
-        </w:tabs>
-        <w:ind w:left="3600" w:hanging="360"/>
-      </w:pPr>
-      <w:rPr>
-        <w:sz w:val="24"/>
-        <w:szCs w:val="24"/>
-      </w:rPr>
-    </w:lvl>
-    <w:lvl w:ilvl="5" w:tentative="0">
-      <w:start w:val="1"/>
-      <w:numFmt w:val="decimal"/>
-      <w:lvlText w:val="%6."/>
-      <w:lvlJc w:val="left"/>
-      <w:pPr>
-        <w:tabs>
-          <w:tab w:val="left" w:pos="3958"/>
-        </w:tabs>
-        <w:ind w:left="4320" w:hanging="360"/>
-      </w:pPr>
-      <w:rPr>
-        <w:sz w:val="24"/>
-        <w:szCs w:val="24"/>
-      </w:rPr>
-    </w:lvl>
-    <w:lvl w:ilvl="6" w:tentative="0">
-      <w:start w:val="1"/>
-      <w:numFmt w:val="decimal"/>
-      <w:lvlText w:val="%7."/>
-      <w:lvlJc w:val="left"/>
-      <w:pPr>
-        <w:tabs>
-          <w:tab w:val="left" w:pos="4678"/>
-        </w:tabs>
-        <w:ind w:left="5040" w:hanging="360"/>
-      </w:pPr>
-      <w:rPr>
-        <w:sz w:val="24"/>
-        <w:szCs w:val="24"/>
-      </w:rPr>
-    </w:lvl>
-    <w:lvl w:ilvl="7" w:tentative="0">
-      <w:start w:val="1"/>
-      <w:numFmt w:val="decimal"/>
-      <w:lvlText w:val="%8."/>
-      <w:lvlJc w:val="left"/>
-      <w:pPr>
-        <w:tabs>
-          <w:tab w:val="left" w:pos="5398"/>
-        </w:tabs>
-        <w:ind w:left="5760" w:hanging="360"/>
-      </w:pPr>
-      <w:rPr>
-        <w:sz w:val="24"/>
-        <w:szCs w:val="24"/>
-      </w:rPr>
-    </w:lvl>
-    <w:lvl w:ilvl="8" w:tentative="0">
-      <w:start w:val="1"/>
-      <w:numFmt w:val="decimal"/>
-      <w:lvlText w:val="%9."/>
-      <w:lvlJc w:val="left"/>
-      <w:pPr>
-        <w:tabs>
-          <w:tab w:val="left" w:pos="6118"/>
-        </w:tabs>
-        <w:ind w:left="6480" w:hanging="360"/>
-      </w:pPr>
-      <w:rPr>
-        <w:sz w:val="24"/>
-        <w:szCs w:val="24"/>
-      </w:rPr>
-    </w:lvl>
-  </w:abstractNum>
-  <w:abstractNum w:abstractNumId="7">
-    <w:nsid w:val="41CC9473"/>
-    <w:multiLevelType w:val="multilevel"/>
-    <w:tmpl w:val="41CC9473"/>
-    <w:lvl w:ilvl="0" w:tentative="0">
-      <w:start w:val="1"/>
-      <w:numFmt w:val="decimal"/>
-      <w:lvlText w:val="%1."/>
-      <w:lvlJc w:val="left"/>
-      <w:pPr>
-        <w:tabs>
-          <w:tab w:val="left" w:pos="720"/>
-        </w:tabs>
-        <w:ind w:left="720" w:hanging="360"/>
-      </w:pPr>
-      <w:rPr>
-        <w:sz w:val="24"/>
-        <w:szCs w:val="24"/>
-      </w:rPr>
-    </w:lvl>
-    <w:lvl w:ilvl="1" w:tentative="0">
-      <w:start w:val="1"/>
-      <w:numFmt w:val="decimal"/>
-      <w:lvlText w:val="%2."/>
-      <w:lvlJc w:val="left"/>
-      <w:pPr>
-        <w:tabs>
-          <w:tab w:val="left" w:pos="1440"/>
-        </w:tabs>
-        <w:ind w:left="1440" w:hanging="360"/>
-      </w:pPr>
-      <w:rPr>
-        <w:sz w:val="24"/>
-        <w:szCs w:val="24"/>
-      </w:rPr>
-    </w:lvl>
-    <w:lvl w:ilvl="2" w:tentative="0">
-      <w:start w:val="1"/>
-      <w:numFmt w:val="decimal"/>
-      <w:lvlText w:val="%3."/>
-      <w:lvlJc w:val="left"/>
-      <w:pPr>
-        <w:tabs>
-          <w:tab w:val="left" w:pos="2160"/>
-        </w:tabs>
-        <w:ind w:left="2160" w:hanging="360"/>
-      </w:pPr>
-      <w:rPr>
-        <w:sz w:val="24"/>
-        <w:szCs w:val="24"/>
-      </w:rPr>
-    </w:lvl>
-    <w:lvl w:ilvl="3" w:tentative="0">
-      <w:start w:val="1"/>
-      <w:numFmt w:val="decimal"/>
-      <w:lvlText w:val="%4."/>
-      <w:lvlJc w:val="left"/>
-      <w:pPr>
-        <w:tabs>
-          <w:tab w:val="left" w:pos="2517"/>
-        </w:tabs>
-        <w:ind w:left="2880" w:hanging="360"/>
-      </w:pPr>
-      <w:rPr>
-        <w:sz w:val="24"/>
-        <w:szCs w:val="24"/>
-      </w:rPr>
-    </w:lvl>
-    <w:lvl w:ilvl="4" w:tentative="0">
-      <w:start w:val="1"/>
-      <w:numFmt w:val="decimal"/>
-      <w:lvlText w:val="%5."/>
-      <w:lvlJc w:val="left"/>
-      <w:pPr>
-        <w:tabs>
-          <w:tab w:val="left" w:pos="3238"/>
-        </w:tabs>
-        <w:ind w:left="3600" w:hanging="360"/>
-      </w:pPr>
-      <w:rPr>
-        <w:sz w:val="24"/>
-        <w:szCs w:val="24"/>
-      </w:rPr>
-    </w:lvl>
-    <w:lvl w:ilvl="5" w:tentative="0">
-      <w:start w:val="1"/>
-      <w:numFmt w:val="decimal"/>
-      <w:lvlText w:val="%6."/>
-      <w:lvlJc w:val="left"/>
-      <w:pPr>
-        <w:tabs>
-          <w:tab w:val="left" w:pos="3958"/>
-        </w:tabs>
-        <w:ind w:left="4320" w:hanging="360"/>
-      </w:pPr>
-      <w:rPr>
-        <w:sz w:val="24"/>
-        <w:szCs w:val="24"/>
-      </w:rPr>
-    </w:lvl>
-    <w:lvl w:ilvl="6" w:tentative="0">
-      <w:start w:val="1"/>
-      <w:numFmt w:val="decimal"/>
-      <w:lvlText w:val="%7."/>
-      <w:lvlJc w:val="left"/>
-      <w:pPr>
-        <w:tabs>
-          <w:tab w:val="left" w:pos="4678"/>
-        </w:tabs>
-        <w:ind w:left="5040" w:hanging="360"/>
-      </w:pPr>
-      <w:rPr>
-        <w:sz w:val="24"/>
-        <w:szCs w:val="24"/>
-      </w:rPr>
-    </w:lvl>
-    <w:lvl w:ilvl="7" w:tentative="0">
-      <w:start w:val="1"/>
-      <w:numFmt w:val="decimal"/>
-      <w:lvlText w:val="%8."/>
-      <w:lvlJc w:val="left"/>
-      <w:pPr>
-        <w:tabs>
-          <w:tab w:val="left" w:pos="5398"/>
-        </w:tabs>
-        <w:ind w:left="5760" w:hanging="360"/>
-      </w:pPr>
-      <w:rPr>
-        <w:sz w:val="24"/>
-        <w:szCs w:val="24"/>
-      </w:rPr>
-    </w:lvl>
-    <w:lvl w:ilvl="8" w:tentative="0">
-      <w:start w:val="1"/>
-      <w:numFmt w:val="decimal"/>
-      <w:lvlText w:val="%9."/>
-      <w:lvlJc w:val="left"/>
-      <w:pPr>
-        <w:tabs>
-          <w:tab w:val="left" w:pos="6118"/>
-        </w:tabs>
-        <w:ind w:left="6480" w:hanging="360"/>
-      </w:pPr>
-      <w:rPr>
-        <w:sz w:val="24"/>
-        <w:szCs w:val="24"/>
-      </w:rPr>
-    </w:lvl>
-  </w:abstractNum>
   <w:num w:numId="1">
-    <w:abstractNumId w:val="4"/>
+    <w:abstractNumId w:val="1"/>
   </w:num>
   <w:num w:numId="2">
-    <w:abstractNumId w:val="1"/>
+    <w:abstractNumId w:val="6"/>
   </w:num>
   <w:num w:numId="3">
     <w:abstractNumId w:val="3"/>
   </w:num>
   <w:num w:numId="4">
-    <w:abstractNumId w:val="7"/>
+    <w:abstractNumId w:val="0"/>
   </w:num>
   <w:num w:numId="5">
-    <w:abstractNumId w:val="1"/>
+    <w:abstractNumId w:val="6"/>
     <w:lvlOverride w:ilvl="0">
       <w:startOverride w:val="1"/>
     </w:lvlOverride>
@@ -7570,16 +7857,16 @@
     </w:lvlOverride>
   </w:num>
   <w:num w:numId="6">
+    <w:abstractNumId w:val="2"/>
+  </w:num>
+  <w:num w:numId="7">
+    <w:abstractNumId w:val="4"/>
+  </w:num>
+  <w:num w:numId="8">
     <w:abstractNumId w:val="5"/>
   </w:num>
-  <w:num w:numId="7">
-    <w:abstractNumId w:val="0"/>
-  </w:num>
-  <w:num w:numId="8">
-    <w:abstractNumId w:val="6"/>
-  </w:num>
   <w:num w:numId="9">
-    <w:abstractNumId w:val="2"/>
+    <w:abstractNumId w:val="7"/>
   </w:num>
 </w:numbering>
 </file>
@@ -7660,7 +7947,7 @@
     <w:lsdException w:qFormat="1" w:unhideWhenUsed="0" w:uiPriority="0" w:semiHidden="0" w:name="Title"/>
     <w:lsdException w:unhideWhenUsed="0" w:uiPriority="0" w:semiHidden="0" w:name="Closing"/>
     <w:lsdException w:unhideWhenUsed="0" w:uiPriority="0" w:semiHidden="0" w:name="Signature"/>
-    <w:lsdException w:qFormat="1" w:unhideWhenUsed="0" w:uiPriority="0" w:name="Default Paragraph Font"/>
+    <w:lsdException w:unhideWhenUsed="0" w:uiPriority="0" w:name="Default Paragraph Font"/>
     <w:lsdException w:unhideWhenUsed="0" w:uiPriority="0" w:semiHidden="0" w:name="Body Text"/>
     <w:lsdException w:unhideWhenUsed="0" w:uiPriority="0" w:semiHidden="0" w:name="Body Text Indent"/>
     <w:lsdException w:unhideWhenUsed="0" w:uiPriority="0" w:semiHidden="0" w:name="List Continue"/>
@@ -7698,7 +7985,7 @@
     <w:lsdException w:unhideWhenUsed="0" w:uiPriority="0" w:semiHidden="0" w:name="HTML Sample"/>
     <w:lsdException w:unhideWhenUsed="0" w:uiPriority="0" w:semiHidden="0" w:name="HTML Typewriter"/>
     <w:lsdException w:unhideWhenUsed="0" w:uiPriority="0" w:semiHidden="0" w:name="HTML Variable"/>
-    <w:lsdException w:qFormat="1" w:unhideWhenUsed="0" w:uiPriority="0" w:name="Normal Table"/>
+    <w:lsdException w:unhideWhenUsed="0" w:uiPriority="0" w:name="Normal Table"/>
     <w:lsdException w:unhideWhenUsed="0" w:uiPriority="0" w:semiHidden="0" w:name="annotation subject"/>
     <w:lsdException w:unhideWhenUsed="0" w:uiPriority="0" w:semiHidden="0" w:name="Table Simple 1"/>
     <w:lsdException w:unhideWhenUsed="0" w:uiPriority="0" w:semiHidden="0" w:name="Table Simple 2"/>
@@ -8001,13 +8288,11 @@
   <w:style w:type="character" w:default="1" w:styleId="8">
     <w:name w:val="Default Paragraph Font"/>
     <w:semiHidden/>
-    <w:qFormat/>
     <w:uiPriority w:val="0"/>
   </w:style>
   <w:style w:type="table" w:default="1" w:styleId="9">
     <w:name w:val="Normal Table"/>
     <w:semiHidden/>
-    <w:qFormat/>
     <w:uiPriority w:val="0"/>
     <w:tblPr>
       <w:tblCellMar>
@@ -8102,6 +8387,35 @@
     </w:rPr>
   </w:style>
   <w:style w:type="paragraph" w:customStyle="1" w:styleId="14">
+    <w:name w:val="step"/>
+    <w:basedOn w:val="1"/>
+    <w:uiPriority w:val="0"/>
+    <w:pPr>
+      <w:spacing w:before="72" w:beforeAutospacing="0" w:after="72" w:afterAutospacing="0"/>
+      <w:ind w:left="0" w:right="0"/>
+      <w:jc w:val="left"/>
+    </w:pPr>
+    <w:rPr>
+      <w:kern w:val="0"/>
+      <w:lang w:val="en-US" w:eastAsia="zh-CN" w:bidi="ar"/>
+    </w:rPr>
+  </w:style>
+  <w:style w:type="paragraph" w:customStyle="1" w:styleId="15">
+    <w:name w:val="sub"/>
+    <w:basedOn w:val="1"/>
+    <w:uiPriority w:val="0"/>
+    <w:pPr>
+      <w:jc w:val="left"/>
+    </w:pPr>
+    <w:rPr>
+      <w:color w:val="555555"/>
+      <w:kern w:val="0"/>
+      <w:sz w:val="28"/>
+      <w:szCs w:val="28"/>
+      <w:lang w:val="en-US" w:eastAsia="zh-CN" w:bidi="ar"/>
+    </w:rPr>
+  </w:style>
+  <w:style w:type="paragraph" w:customStyle="1" w:styleId="16">
     <w:name w:val="tip"/>
     <w:basedOn w:val="1"/>
     <w:uiPriority w:val="0"/>
@@ -8119,35 +8433,6 @@
     </w:pPr>
     <w:rPr>
       <w:kern w:val="0"/>
-      <w:lang w:val="en-US" w:eastAsia="zh-CN" w:bidi="ar"/>
-    </w:rPr>
-  </w:style>
-  <w:style w:type="paragraph" w:customStyle="1" w:styleId="15">
-    <w:name w:val="step"/>
-    <w:basedOn w:val="1"/>
-    <w:uiPriority w:val="0"/>
-    <w:pPr>
-      <w:spacing w:before="72" w:beforeAutospacing="0" w:after="72" w:afterAutospacing="0"/>
-      <w:ind w:left="0" w:right="0"/>
-      <w:jc w:val="left"/>
-    </w:pPr>
-    <w:rPr>
-      <w:kern w:val="0"/>
-      <w:lang w:val="en-US" w:eastAsia="zh-CN" w:bidi="ar"/>
-    </w:rPr>
-  </w:style>
-  <w:style w:type="paragraph" w:customStyle="1" w:styleId="16">
-    <w:name w:val="sub"/>
-    <w:basedOn w:val="1"/>
-    <w:uiPriority w:val="0"/>
-    <w:pPr>
-      <w:jc w:val="left"/>
-    </w:pPr>
-    <w:rPr>
-      <w:color w:val="555555"/>
-      <w:kern w:val="0"/>
-      <w:sz w:val="28"/>
-      <w:szCs w:val="28"/>
       <w:lang w:val="en-US" w:eastAsia="zh-CN" w:bidi="ar"/>
     </w:rPr>
   </w:style>

</xml_diff>